<commit_message>
Removed personal info from cv
</commit_message>
<xml_diff>
--- a/files/resume_en_v2.docx
+++ b/files/resume_en_v2.docx
@@ -306,20 +306,7 @@
           <w:szCs w:val="20"/>
           <w:lang w:val="en-GB"/>
         </w:rPr>
-        <w:t>www.</w:t>
-      </w:r>
-      <w:bookmarkStart w:id="0" w:name="_GoBack"/>
-      <w:bookmarkEnd w:id="0"/>
-      <w:r>
-        <w:rPr>
-          <w:rFonts w:ascii="Open Sans Light" w:hAnsi="Open Sans Light" w:cs="Open Sans Light"/>
-          <w:noProof/>
-          <w:color w:val="000000" w:themeColor="text1"/>
-          <w:sz w:val="20"/>
-          <w:szCs w:val="20"/>
-          <w:lang w:val="en-GB"/>
-        </w:rPr>
-        <w:t>moadessabbar.com</w:t>
+        <w:t>www.moadessabbar.com</w:t>
       </w:r>
     </w:p>
     <w:p>
@@ -358,7 +345,7 @@
           <w:szCs w:val="20"/>
           <w:lang w:val="en-GB"/>
         </w:rPr>
-        <w:t>34090 Montpellier</w:t>
+        <w:t>Address</w:t>
       </w:r>
       <w:r>
         <w:rPr>
@@ -381,17 +368,6 @@
           <w:lang w:val="en-GB"/>
         </w:rPr>
         <w:t>Driving Lisence</w:t>
-      </w:r>
-      <w:r>
-        <w:rPr>
-          <w:rFonts w:ascii="Open Sans Light" w:hAnsi="Open Sans Light" w:cs="Open Sans Light"/>
-          <w:noProof/>
-          <w:color w:val="000000" w:themeColor="text1"/>
-          <w:sz w:val="20"/>
-          <w:szCs w:val="20"/>
-          <w:lang w:val="en-GB"/>
-        </w:rPr>
-        <w:t xml:space="preserve"> B</w:t>
       </w:r>
     </w:p>
     <w:p>
@@ -439,29 +415,29 @@
           <w:szCs w:val="20"/>
           <w:lang w:val="en-GB"/>
         </w:rPr>
-        <w:t>07 55 44 83 8</w:t>
-      </w:r>
-      <w:r>
-        <w:rPr>
-          <w:rFonts w:ascii="Open Sans Light" w:hAnsi="Open Sans Light" w:cs="Open Sans Light"/>
-          <w:noProof/>
-          <w:color w:val="000000" w:themeColor="text1"/>
-          <w:sz w:val="20"/>
-          <w:szCs w:val="20"/>
-          <w:lang w:val="en-GB"/>
-        </w:rPr>
-        <w:t xml:space="preserve">1 • </w:t>
-      </w:r>
-      <w:r>
-        <w:rPr>
-          <w:rFonts w:ascii="Open Sans Light" w:hAnsi="Open Sans Light" w:cs="Open Sans Light"/>
-          <w:noProof/>
-          <w:color w:val="000000" w:themeColor="text1"/>
-          <w:sz w:val="20"/>
-          <w:szCs w:val="20"/>
-          <w:lang w:val="en-GB"/>
-        </w:rPr>
-        <w:t>moad.essabbar@gmail.com</w:t>
+        <w:t>Phone</w:t>
+      </w:r>
+      <w:r>
+        <w:rPr>
+          <w:rFonts w:ascii="Open Sans Light" w:hAnsi="Open Sans Light" w:cs="Open Sans Light"/>
+          <w:noProof/>
+          <w:color w:val="000000" w:themeColor="text1"/>
+          <w:sz w:val="20"/>
+          <w:szCs w:val="20"/>
+          <w:lang w:val="en-GB"/>
+        </w:rPr>
+        <w:t xml:space="preserve"> •</w:t>
+      </w:r>
+      <w:r>
+        <w:rPr>
+          <w:rFonts w:ascii="Open Sans Light" w:hAnsi="Open Sans Light" w:cs="Open Sans Light"/>
+          <w:noProof/>
+          <w:color w:val="000000" w:themeColor="text1"/>
+          <w:sz w:val="20"/>
+          <w:szCs w:val="20"/>
+          <w:lang w:val="en-GB"/>
+        </w:rPr>
+        <w:t xml:space="preserve"> e-mail</w:t>
       </w:r>
       <w:r>
         <w:rPr>
@@ -474,6 +450,8 @@
         </w:rPr>
         <w:t xml:space="preserve"> </w:t>
       </w:r>
+      <w:bookmarkStart w:id="0" w:name="_GoBack"/>
+      <w:bookmarkEnd w:id="0"/>
     </w:p>
     <w:p>
       <w:pPr>
@@ -5104,7 +5082,7 @@
 </file>
 
 <file path=customXml/itemProps1.xml><?xml version="1.0" encoding="utf-8"?>
-<ds:datastoreItem xmlns:ds="http://schemas.openxmlformats.org/officeDocument/2006/customXml" ds:itemID="{6C666D37-131D-477A-8C9E-2FD39C16577D}">
+<ds:datastoreItem xmlns:ds="http://schemas.openxmlformats.org/officeDocument/2006/customXml" ds:itemID="{25B74094-6774-419D-9E74-1433BC624B0D}">
   <ds:schemaRefs>
     <ds:schemaRef ds:uri="http://schemas.openxmlformats.org/officeDocument/2006/bibliography"/>
   </ds:schemaRefs>

</xml_diff>